<commit_message>
Add Google Search Console verification meta tag
</commit_message>
<xml_diff>
--- a/Schema_Business_06.docx
+++ b/Schema_Business_06.docx
@@ -200,6 +200,148 @@
           <w:color w:val="EE0000"/>
         </w:rPr>
         <w:t>Vuoi che passiamo alla fase successiva per iniziare ad automatizzare l'indicizzazione di queste pagine sui motori di ricerca e massimizzare l'afflusso di traffico?</w:t>
+      </w:r>
+    </w:p>
+    <w:p>
+      <w:pPr>
+        <w:rPr>
+          <w:b/>
+          <w:bCs/>
+        </w:rPr>
+      </w:pPr>
+      <w:r>
+        <w:rPr>
+          <w:rFonts w:ascii="Segoe UI Emoji" w:hAnsi="Segoe UI Emoji" w:cs="Segoe UI Emoji"/>
+          <w:b/>
+          <w:bCs/>
+        </w:rPr>
+        <w:lastRenderedPageBreak/>
+        <w:t>🛠️</w:t>
+      </w:r>
+      <w:r>
+        <w:rPr>
+          <w:b/>
+          <w:bCs/>
+        </w:rPr>
+        <w:t xml:space="preserve"> I prossimi passaggi operativi:</w:t>
+      </w:r>
+    </w:p>
+    <w:p>
+      <w:pPr>
+        <w:numPr>
+          <w:ilvl w:val="0"/>
+          <w:numId w:val="3"/>
+        </w:numPr>
+      </w:pPr>
+      <w:r>
+        <w:rPr>
+          <w:b/>
+          <w:bCs/>
+        </w:rPr>
+        <w:t xml:space="preserve">Verifica della </w:t>
+      </w:r>
+      <w:proofErr w:type="spellStart"/>
+      <w:r>
+        <w:rPr>
+          <w:b/>
+          <w:bCs/>
+        </w:rPr>
+        <w:t>Sitemap</w:t>
+      </w:r>
+      <w:proofErr w:type="spellEnd"/>
+      <w:r>
+        <w:rPr>
+          <w:b/>
+          <w:bCs/>
+        </w:rPr>
+        <w:t xml:space="preserve"> online:</w:t>
+      </w:r>
+      <w:r>
+        <w:t xml:space="preserve"> Assicurati che l'indirizzo [</w:t>
+      </w:r>
+      <w:proofErr w:type="gramStart"/>
+      <w:r>
+        <w:t>https://brendaglobo-pseo.geom-cmarco.workers.dev/sitemap.xml](</w:t>
+      </w:r>
+      <w:proofErr w:type="gramEnd"/>
+      <w:r>
+        <w:t>https://brendaglobo-pseo.geom-cmarco.workers.dev/sitemap.xml) sia raggiungibile e mostri l'elenco completo di tutti i link.</w:t>
+      </w:r>
+    </w:p>
+    <w:p>
+      <w:pPr>
+        <w:numPr>
+          <w:ilvl w:val="0"/>
+          <w:numId w:val="3"/>
+        </w:numPr>
+      </w:pPr>
+      <w:r>
+        <w:rPr>
+          <w:b/>
+          <w:bCs/>
+        </w:rPr>
+        <w:t>Google Search Console:</w:t>
+      </w:r>
+      <w:r>
+        <w:t xml:space="preserve"> Collegheremo la proprietà per monitorare lo stato di salute del sito e inviare ufficialmente la </w:t>
+      </w:r>
+      <w:proofErr w:type="spellStart"/>
+      <w:r>
+        <w:t>sitemap</w:t>
+      </w:r>
+      <w:proofErr w:type="spellEnd"/>
+      <w:r>
+        <w:t>.</w:t>
+      </w:r>
+    </w:p>
+    <w:p>
+      <w:pPr>
+        <w:numPr>
+          <w:ilvl w:val="0"/>
+          <w:numId w:val="3"/>
+        </w:numPr>
+      </w:pPr>
+      <w:r>
+        <w:rPr>
+          <w:b/>
+          <w:bCs/>
+        </w:rPr>
+        <w:t xml:space="preserve">Google </w:t>
+      </w:r>
+      <w:proofErr w:type="spellStart"/>
+      <w:r>
+        <w:rPr>
+          <w:b/>
+          <w:bCs/>
+        </w:rPr>
+        <w:t>Indexing</w:t>
+      </w:r>
+      <w:proofErr w:type="spellEnd"/>
+      <w:r>
+        <w:rPr>
+          <w:b/>
+          <w:bCs/>
+        </w:rPr>
+        <w:t xml:space="preserve"> API (Mass </w:t>
+      </w:r>
+      <w:proofErr w:type="spellStart"/>
+      <w:r>
+        <w:rPr>
+          <w:b/>
+          <w:bCs/>
+        </w:rPr>
+        <w:t>Indexing</w:t>
+      </w:r>
+      <w:proofErr w:type="spellEnd"/>
+      <w:r>
+        <w:rPr>
+          <w:b/>
+          <w:bCs/>
+        </w:rPr>
+        <w:t>):</w:t>
+      </w:r>
+      <w:r>
+        <w:t xml:space="preserve"> Implementeremo un sistema automatizzato per sottoporre a Google l'intero blocco di URL in modo massivo, bypassando i lunghi tempi d'attesa della scansione organica tradizionale.</w:t>
       </w:r>
     </w:p>
     <w:p/>
@@ -513,11 +655,163 @@
       </w:rPr>
     </w:lvl>
   </w:abstractNum>
+  <w:abstractNum w:abstractNumId="2" w15:restartNumberingAfterBreak="0">
+    <w:nsid w:val="56EB340D"/>
+    <w:multiLevelType w:val="multilevel"/>
+    <w:tmpl w:val="437AFDD0"/>
+    <w:lvl w:ilvl="0">
+      <w:start w:val="1"/>
+      <w:numFmt w:val="bullet"/>
+      <w:lvlText w:val=""/>
+      <w:lvlJc w:val="left"/>
+      <w:pPr>
+        <w:tabs>
+          <w:tab w:val="num" w:pos="720"/>
+        </w:tabs>
+        <w:ind w:left="720" w:hanging="360"/>
+      </w:pPr>
+      <w:rPr>
+        <w:rFonts w:ascii="Symbol" w:hAnsi="Symbol" w:hint="default"/>
+        <w:sz w:val="20"/>
+      </w:rPr>
+    </w:lvl>
+    <w:lvl w:ilvl="1" w:tentative="1">
+      <w:start w:val="1"/>
+      <w:numFmt w:val="bullet"/>
+      <w:lvlText w:val="o"/>
+      <w:lvlJc w:val="left"/>
+      <w:pPr>
+        <w:tabs>
+          <w:tab w:val="num" w:pos="1440"/>
+        </w:tabs>
+        <w:ind w:left="1440" w:hanging="360"/>
+      </w:pPr>
+      <w:rPr>
+        <w:rFonts w:ascii="Courier New" w:hAnsi="Courier New" w:hint="default"/>
+        <w:sz w:val="20"/>
+      </w:rPr>
+    </w:lvl>
+    <w:lvl w:ilvl="2" w:tentative="1">
+      <w:start w:val="1"/>
+      <w:numFmt w:val="bullet"/>
+      <w:lvlText w:val=""/>
+      <w:lvlJc w:val="left"/>
+      <w:pPr>
+        <w:tabs>
+          <w:tab w:val="num" w:pos="2160"/>
+        </w:tabs>
+        <w:ind w:left="2160" w:hanging="360"/>
+      </w:pPr>
+      <w:rPr>
+        <w:rFonts w:ascii="Wingdings" w:hAnsi="Wingdings" w:hint="default"/>
+        <w:sz w:val="20"/>
+      </w:rPr>
+    </w:lvl>
+    <w:lvl w:ilvl="3" w:tentative="1">
+      <w:start w:val="1"/>
+      <w:numFmt w:val="bullet"/>
+      <w:lvlText w:val=""/>
+      <w:lvlJc w:val="left"/>
+      <w:pPr>
+        <w:tabs>
+          <w:tab w:val="num" w:pos="2880"/>
+        </w:tabs>
+        <w:ind w:left="2880" w:hanging="360"/>
+      </w:pPr>
+      <w:rPr>
+        <w:rFonts w:ascii="Wingdings" w:hAnsi="Wingdings" w:hint="default"/>
+        <w:sz w:val="20"/>
+      </w:rPr>
+    </w:lvl>
+    <w:lvl w:ilvl="4" w:tentative="1">
+      <w:start w:val="1"/>
+      <w:numFmt w:val="bullet"/>
+      <w:lvlText w:val=""/>
+      <w:lvlJc w:val="left"/>
+      <w:pPr>
+        <w:tabs>
+          <w:tab w:val="num" w:pos="3600"/>
+        </w:tabs>
+        <w:ind w:left="3600" w:hanging="360"/>
+      </w:pPr>
+      <w:rPr>
+        <w:rFonts w:ascii="Wingdings" w:hAnsi="Wingdings" w:hint="default"/>
+        <w:sz w:val="20"/>
+      </w:rPr>
+    </w:lvl>
+    <w:lvl w:ilvl="5" w:tentative="1">
+      <w:start w:val="1"/>
+      <w:numFmt w:val="bullet"/>
+      <w:lvlText w:val=""/>
+      <w:lvlJc w:val="left"/>
+      <w:pPr>
+        <w:tabs>
+          <w:tab w:val="num" w:pos="4320"/>
+        </w:tabs>
+        <w:ind w:left="4320" w:hanging="360"/>
+      </w:pPr>
+      <w:rPr>
+        <w:rFonts w:ascii="Wingdings" w:hAnsi="Wingdings" w:hint="default"/>
+        <w:sz w:val="20"/>
+      </w:rPr>
+    </w:lvl>
+    <w:lvl w:ilvl="6" w:tentative="1">
+      <w:start w:val="1"/>
+      <w:numFmt w:val="bullet"/>
+      <w:lvlText w:val=""/>
+      <w:lvlJc w:val="left"/>
+      <w:pPr>
+        <w:tabs>
+          <w:tab w:val="num" w:pos="5040"/>
+        </w:tabs>
+        <w:ind w:left="5040" w:hanging="360"/>
+      </w:pPr>
+      <w:rPr>
+        <w:rFonts w:ascii="Wingdings" w:hAnsi="Wingdings" w:hint="default"/>
+        <w:sz w:val="20"/>
+      </w:rPr>
+    </w:lvl>
+    <w:lvl w:ilvl="7" w:tentative="1">
+      <w:start w:val="1"/>
+      <w:numFmt w:val="bullet"/>
+      <w:lvlText w:val=""/>
+      <w:lvlJc w:val="left"/>
+      <w:pPr>
+        <w:tabs>
+          <w:tab w:val="num" w:pos="5760"/>
+        </w:tabs>
+        <w:ind w:left="5760" w:hanging="360"/>
+      </w:pPr>
+      <w:rPr>
+        <w:rFonts w:ascii="Wingdings" w:hAnsi="Wingdings" w:hint="default"/>
+        <w:sz w:val="20"/>
+      </w:rPr>
+    </w:lvl>
+    <w:lvl w:ilvl="8" w:tentative="1">
+      <w:start w:val="1"/>
+      <w:numFmt w:val="bullet"/>
+      <w:lvlText w:val=""/>
+      <w:lvlJc w:val="left"/>
+      <w:pPr>
+        <w:tabs>
+          <w:tab w:val="num" w:pos="6480"/>
+        </w:tabs>
+        <w:ind w:left="6480" w:hanging="360"/>
+      </w:pPr>
+      <w:rPr>
+        <w:rFonts w:ascii="Wingdings" w:hAnsi="Wingdings" w:hint="default"/>
+        <w:sz w:val="20"/>
+      </w:rPr>
+    </w:lvl>
+  </w:abstractNum>
   <w:num w:numId="1" w16cid:durableId="183058343">
     <w:abstractNumId w:val="1"/>
   </w:num>
   <w:num w:numId="2" w16cid:durableId="115830874">
     <w:abstractNumId w:val="0"/>
+  </w:num>
+  <w:num w:numId="3" w16cid:durableId="1403522087">
+    <w:abstractNumId w:val="2"/>
   </w:num>
 </w:numbering>
 </file>

</xml_diff>